<commit_message>
day 13 home task
</commit_message>
<xml_diff>
--- a/10096255_Day13.docx
+++ b/10096255_Day13.docx
@@ -22,6 +22,9 @@
     </w:p>
     <w:p>
       <w:r>
+        <w:rPr>
+          <w:noProof/>
+        </w:rPr>
         <w:drawing>
           <wp:inline distT="0" distB="0" distL="0" distR="0" wp14:anchorId="6A419AE7" wp14:editId="0BC83FA9">
             <wp:extent cx="5731510" cy="4691380"/>
@@ -584,23 +587,7 @@
           <w:b/>
           <w:bCs/>
         </w:rPr>
-        <w:t>Task 6:Add a check constraint to your column (</w:t>
-      </w:r>
-      <w:proofErr w:type="spellStart"/>
-      <w:r>
-        <w:rPr>
-          <w:b/>
-          <w:bCs/>
-        </w:rPr>
-        <w:t>eg</w:t>
-      </w:r>
-      <w:proofErr w:type="spellEnd"/>
-      <w:r>
-        <w:rPr>
-          <w:b/>
-          <w:bCs/>
-        </w:rPr>
-        <w:t>: balance &gt; 0)</w:t>
+        <w:t>Task 6:Add a check constraint to your column (eg: balance &gt; 0)</w:t>
       </w:r>
       <w:r>
         <w:rPr>
@@ -618,14 +605,7 @@
       </w:r>
       <w:r>
         <w:br/>
-      </w:r>
-      <w:proofErr w:type="spellStart"/>
-      <w:r>
-        <w:t>custName</w:t>
-      </w:r>
-      <w:proofErr w:type="spellEnd"/>
-      <w:r>
-        <w:t xml:space="preserve"> varchar (10),</w:t>
+        <w:t>custName varchar (10),</w:t>
       </w:r>
       <w:r>
         <w:br/>
@@ -681,15 +661,7 @@
       </w:r>
       <w:r>
         <w:br/>
-        <w:t xml:space="preserve">select * from accounts order by balance </w:t>
-      </w:r>
-      <w:proofErr w:type="spellStart"/>
-      <w:r>
-        <w:t>desc</w:t>
-      </w:r>
-      <w:proofErr w:type="spellEnd"/>
-      <w:r>
-        <w:t>;</w:t>
+        <w:t>select * from accounts order by balance desc;</w:t>
       </w:r>
       <w:r>
         <w:br/>
@@ -706,15 +678,7 @@
       </w:r>
       <w:r>
         <w:br/>
-        <w:t xml:space="preserve">select * from accounts order by balance </w:t>
-      </w:r>
-      <w:proofErr w:type="spellStart"/>
-      <w:r>
-        <w:t>desc</w:t>
-      </w:r>
-      <w:proofErr w:type="spellEnd"/>
-      <w:r>
-        <w:t xml:space="preserve"> LIMIT 2;</w:t>
+        <w:t>select * from accounts order by balance desc LIMIT 2;</w:t>
       </w:r>
     </w:p>
     <w:p/>
@@ -734,62 +698,12 @@
           <w:bCs/>
         </w:rPr>
         <w:lastRenderedPageBreak/>
-        <w:t>Task 10:Create queries for left outer join</w:t>
-      </w:r>
-      <w:r>
-        <w:rPr>
-          <w:b/>
-          <w:bCs/>
-        </w:rPr>
-        <w:t xml:space="preserve"> ,</w:t>
-      </w:r>
-      <w:r>
-        <w:rPr>
-          <w:b/>
-          <w:bCs/>
-        </w:rPr>
-        <w:t>Right outer join</w:t>
-      </w:r>
-      <w:r>
-        <w:rPr>
-          <w:b/>
-          <w:bCs/>
-        </w:rPr>
-        <w:t xml:space="preserve"> ,</w:t>
-      </w:r>
-      <w:r>
-        <w:rPr>
-          <w:b/>
-          <w:bCs/>
-        </w:rPr>
-        <w:t>Inner join</w:t>
-      </w:r>
-      <w:r>
-        <w:rPr>
-          <w:b/>
-          <w:bCs/>
-        </w:rPr>
-        <w:t xml:space="preserve"> ,</w:t>
-      </w:r>
-      <w:r>
-        <w:rPr>
-          <w:b/>
-          <w:bCs/>
-        </w:rPr>
-        <w:t>Cross join</w:t>
-      </w:r>
-    </w:p>
-    <w:p>
-      <w:r>
-        <w:t xml:space="preserve">create table </w:t>
-      </w:r>
-      <w:proofErr w:type="spellStart"/>
-      <w:r>
-        <w:t>frontend_developers</w:t>
-      </w:r>
-      <w:proofErr w:type="spellEnd"/>
-      <w:r>
-        <w:t xml:space="preserve"> (</w:t>
+        <w:t>Task 10:Create queries for left outer join ,Right outer join ,Inner join ,Cross join</w:t>
+      </w:r>
+    </w:p>
+    <w:p>
+      <w:r>
+        <w:t>create table frontend_developers (</w:t>
       </w:r>
     </w:p>
     <w:p>
@@ -807,14 +721,7 @@
     <w:p>
       <w:r>
         <w:tab/>
-      </w:r>
-      <w:proofErr w:type="spellStart"/>
-      <w:r>
-        <w:t>project_id</w:t>
-      </w:r>
-      <w:proofErr w:type="spellEnd"/>
-      <w:r>
-        <w:t xml:space="preserve"> varchar(20)</w:t>
+        <w:t>project_id varchar(20)</w:t>
       </w:r>
     </w:p>
     <w:p>
@@ -824,94 +731,38 @@
     </w:p>
     <w:p>
       <w:r>
-        <w:t xml:space="preserve">insert into </w:t>
-      </w:r>
-      <w:proofErr w:type="spellStart"/>
-      <w:r>
-        <w:t>frontend_developers</w:t>
-      </w:r>
-      <w:proofErr w:type="spellEnd"/>
-      <w:r>
-        <w:t xml:space="preserve"> values (101, 'Ashok', 'P01');</w:t>
-      </w:r>
-    </w:p>
-    <w:p>
-      <w:r>
-        <w:t xml:space="preserve">insert into </w:t>
-      </w:r>
-      <w:proofErr w:type="spellStart"/>
-      <w:r>
-        <w:t>frontend_developers</w:t>
-      </w:r>
-      <w:proofErr w:type="spellEnd"/>
-      <w:r>
-        <w:t xml:space="preserve"> values (102, 'Kishore', 'P02');</w:t>
-      </w:r>
-    </w:p>
-    <w:p>
-      <w:r>
-        <w:t xml:space="preserve">insert into </w:t>
-      </w:r>
-      <w:proofErr w:type="spellStart"/>
-      <w:r>
-        <w:t>frontend_developers</w:t>
-      </w:r>
-      <w:proofErr w:type="spellEnd"/>
-      <w:r>
-        <w:t xml:space="preserve"> values (103, 'Sagar', 'P03');</w:t>
-      </w:r>
-    </w:p>
-    <w:p>
-      <w:r>
-        <w:t xml:space="preserve">insert into </w:t>
-      </w:r>
-      <w:proofErr w:type="spellStart"/>
-      <w:r>
-        <w:t>frontend_developers</w:t>
-      </w:r>
-      <w:proofErr w:type="spellEnd"/>
-      <w:r>
-        <w:t xml:space="preserve"> values (104, 'Hitesh', 'P04');</w:t>
-      </w:r>
-    </w:p>
-    <w:p>
-      <w:r>
-        <w:t xml:space="preserve">insert into </w:t>
-      </w:r>
-      <w:proofErr w:type="spellStart"/>
-      <w:r>
-        <w:t>frontend_developers</w:t>
-      </w:r>
-      <w:proofErr w:type="spellEnd"/>
-      <w:r>
-        <w:t xml:space="preserve"> values (105, 'Hari', 'P44');</w:t>
-      </w:r>
-    </w:p>
-    <w:p/>
-    <w:p>
-      <w:r>
-        <w:t xml:space="preserve">select * from </w:t>
-      </w:r>
-      <w:proofErr w:type="spellStart"/>
-      <w:r>
-        <w:t>frontend_developers</w:t>
-      </w:r>
-      <w:proofErr w:type="spellEnd"/>
-      <w:r>
-        <w:t>;</w:t>
-      </w:r>
-    </w:p>
-    <w:p>
-      <w:r>
-        <w:t xml:space="preserve">create table </w:t>
-      </w:r>
-      <w:proofErr w:type="spellStart"/>
-      <w:r>
-        <w:t>backend_developers</w:t>
-      </w:r>
-      <w:proofErr w:type="spellEnd"/>
-      <w:r>
-        <w:t xml:space="preserve"> (</w:t>
+        <w:t>insert into frontend_developers values (101, 'Ashok', 'P01');</w:t>
+      </w:r>
+    </w:p>
+    <w:p>
+      <w:r>
+        <w:t>insert into frontend_developers values (102, 'Kishore', 'P02');</w:t>
+      </w:r>
+    </w:p>
+    <w:p>
+      <w:r>
+        <w:t>insert into frontend_developers values (103, 'Sagar', 'P03');</w:t>
+      </w:r>
+    </w:p>
+    <w:p>
+      <w:r>
+        <w:t>insert into frontend_developers values (104, 'Hitesh', 'P04');</w:t>
+      </w:r>
+    </w:p>
+    <w:p>
+      <w:r>
+        <w:t>insert into frontend_developers values (105, 'Hari', 'P44');</w:t>
+      </w:r>
+    </w:p>
+    <w:p/>
+    <w:p>
+      <w:r>
+        <w:t>select * from frontend_developers;</w:t>
+      </w:r>
+    </w:p>
+    <w:p>
+      <w:r>
+        <w:t>create table backend_developers (</w:t>
       </w:r>
     </w:p>
     <w:p>
@@ -929,14 +780,7 @@
     <w:p>
       <w:r>
         <w:tab/>
-      </w:r>
-      <w:proofErr w:type="spellStart"/>
-      <w:r>
-        <w:t>project_id</w:t>
-      </w:r>
-      <w:proofErr w:type="spellEnd"/>
-      <w:r>
-        <w:t xml:space="preserve"> varchar(20)</w:t>
+        <w:t>project_id varchar(20)</w:t>
       </w:r>
     </w:p>
     <w:p>
@@ -946,81 +790,33 @@
     </w:p>
     <w:p>
       <w:r>
-        <w:t xml:space="preserve">insert into </w:t>
-      </w:r>
-      <w:proofErr w:type="spellStart"/>
-      <w:r>
-        <w:t>backend_developers</w:t>
-      </w:r>
-      <w:proofErr w:type="spellEnd"/>
-      <w:r>
-        <w:t xml:space="preserve"> values (111, 'Sam', 'P11');</w:t>
-      </w:r>
-    </w:p>
-    <w:p>
-      <w:r>
-        <w:t xml:space="preserve">insert into </w:t>
-      </w:r>
-      <w:proofErr w:type="spellStart"/>
-      <w:r>
-        <w:t>backend_developers</w:t>
-      </w:r>
-      <w:proofErr w:type="spellEnd"/>
-      <w:r>
-        <w:t xml:space="preserve"> values (122, 'Ritu', 'P22');</w:t>
-      </w:r>
-    </w:p>
-    <w:p>
-      <w:r>
-        <w:t xml:space="preserve">insert into </w:t>
-      </w:r>
-      <w:proofErr w:type="spellStart"/>
-      <w:r>
-        <w:t>backend_developers</w:t>
-      </w:r>
-      <w:proofErr w:type="spellEnd"/>
-      <w:r>
-        <w:t xml:space="preserve"> values (103, 'Sagar', 'P33');</w:t>
-      </w:r>
-    </w:p>
-    <w:p>
-      <w:r>
-        <w:t xml:space="preserve">insert into </w:t>
-      </w:r>
-      <w:proofErr w:type="spellStart"/>
-      <w:r>
-        <w:t>backend_developers</w:t>
-      </w:r>
-      <w:proofErr w:type="spellEnd"/>
-      <w:r>
-        <w:t xml:space="preserve"> values (144, 'Nikky', 'P44');</w:t>
-      </w:r>
-    </w:p>
-    <w:p/>
-    <w:p>
-      <w:r>
-        <w:t xml:space="preserve">select * from </w:t>
-      </w:r>
-      <w:proofErr w:type="spellStart"/>
-      <w:r>
-        <w:t>frontend_developers</w:t>
-      </w:r>
-      <w:proofErr w:type="spellEnd"/>
-      <w:r>
-        <w:t>;</w:t>
-      </w:r>
-    </w:p>
-    <w:p>
-      <w:r>
-        <w:t xml:space="preserve">select * from </w:t>
-      </w:r>
-      <w:proofErr w:type="spellStart"/>
-      <w:r>
-        <w:t>backend_developers</w:t>
-      </w:r>
-      <w:proofErr w:type="spellEnd"/>
-      <w:r>
-        <w:t>;</w:t>
+        <w:t>insert into backend_developers values (111, 'Sam', 'P11');</w:t>
+      </w:r>
+    </w:p>
+    <w:p>
+      <w:r>
+        <w:t>insert into backend_developers values (122, 'Ritu', 'P22');</w:t>
+      </w:r>
+    </w:p>
+    <w:p>
+      <w:r>
+        <w:t>insert into backend_developers values (103, 'Sagar', 'P33');</w:t>
+      </w:r>
+    </w:p>
+    <w:p>
+      <w:r>
+        <w:t>insert into backend_developers values (144, 'Nikky', 'P44');</w:t>
+      </w:r>
+    </w:p>
+    <w:p/>
+    <w:p>
+      <w:r>
+        <w:t>select * from frontend_developers;</w:t>
+      </w:r>
+    </w:p>
+    <w:p>
+      <w:r>
+        <w:t>select * from backend_developers;</w:t>
       </w:r>
     </w:p>
     <w:p/>
@@ -1042,88 +838,33 @@
     </w:p>
     <w:p>
       <w:r>
-        <w:t xml:space="preserve">    frontend_developers.name AS </w:t>
-      </w:r>
-      <w:proofErr w:type="spellStart"/>
-      <w:r>
-        <w:t>frontend_name</w:t>
-      </w:r>
-      <w:proofErr w:type="spellEnd"/>
-      <w:r>
-        <w:t>,</w:t>
-      </w:r>
-    </w:p>
-    <w:p>
-      <w:r>
-        <w:t xml:space="preserve">    backend_developers.name AS </w:t>
-      </w:r>
-      <w:proofErr w:type="spellStart"/>
-      <w:r>
-        <w:t>backend_name</w:t>
-      </w:r>
-      <w:proofErr w:type="spellEnd"/>
-      <w:r>
-        <w:t>,</w:t>
-      </w:r>
-    </w:p>
-    <w:p>
-      <w:r>
-        <w:t xml:space="preserve">    </w:t>
-      </w:r>
-      <w:proofErr w:type="spellStart"/>
-      <w:r>
-        <w:t>frontend_developers.project_id</w:t>
-      </w:r>
-      <w:proofErr w:type="spellEnd"/>
-      <w:r>
-        <w:t xml:space="preserve"> AS </w:t>
-      </w:r>
-      <w:proofErr w:type="spellStart"/>
-      <w:r>
-        <w:t>frontend_project</w:t>
-      </w:r>
-      <w:proofErr w:type="spellEnd"/>
-      <w:r>
-        <w:t>,</w:t>
-      </w:r>
-    </w:p>
-    <w:p>
-      <w:r>
-        <w:t xml:space="preserve">    </w:t>
-      </w:r>
-      <w:proofErr w:type="spellStart"/>
-      <w:r>
-        <w:t>backend_developers.project_id</w:t>
-      </w:r>
-      <w:proofErr w:type="spellEnd"/>
-      <w:r>
-        <w:t xml:space="preserve"> AS </w:t>
-      </w:r>
-      <w:proofErr w:type="spellStart"/>
-      <w:r>
-        <w:t>backend_project</w:t>
-      </w:r>
-      <w:proofErr w:type="spellEnd"/>
-    </w:p>
-    <w:p>
-      <w:r>
-        <w:t xml:space="preserve">FROM </w:t>
-      </w:r>
-      <w:proofErr w:type="spellStart"/>
-      <w:r>
-        <w:t>frontend_developers</w:t>
-      </w:r>
-      <w:proofErr w:type="spellEnd"/>
-    </w:p>
-    <w:p>
-      <w:r>
-        <w:t xml:space="preserve">INNER JOIN </w:t>
-      </w:r>
-      <w:proofErr w:type="spellStart"/>
-      <w:r>
-        <w:t>backend_developers</w:t>
-      </w:r>
-      <w:proofErr w:type="spellEnd"/>
+        <w:t xml:space="preserve">    frontend_developers.name AS frontend_name,</w:t>
+      </w:r>
+    </w:p>
+    <w:p>
+      <w:r>
+        <w:t xml:space="preserve">    backend_developers.name AS backend_name,</w:t>
+      </w:r>
+    </w:p>
+    <w:p>
+      <w:r>
+        <w:t xml:space="preserve">    frontend_developers.project_id AS frontend_project,</w:t>
+      </w:r>
+    </w:p>
+    <w:p>
+      <w:r>
+        <w:t xml:space="preserve">    backend_developers.project_id AS backend_project</w:t>
+      </w:r>
+    </w:p>
+    <w:p>
+      <w:r>
+        <w:t>FROM frontend_developers</w:t>
+      </w:r>
+    </w:p>
+    <w:p>
+      <w:r>
+        <w:t>INNER JOIN backend_developers</w:t>
+      </w:r>
     </w:p>
     <w:p>
       <w:r>
@@ -1148,46 +889,23 @@
     </w:p>
     <w:p>
       <w:r>
-        <w:t xml:space="preserve">    frontend_developers.name AS </w:t>
-      </w:r>
-      <w:proofErr w:type="spellStart"/>
-      <w:r>
-        <w:t>frontend_name</w:t>
-      </w:r>
-      <w:proofErr w:type="spellEnd"/>
-      <w:r>
-        <w:t>,</w:t>
-      </w:r>
-    </w:p>
-    <w:p>
-      <w:r>
-        <w:t xml:space="preserve">    backend_developers.name AS </w:t>
-      </w:r>
-      <w:proofErr w:type="spellStart"/>
-      <w:r>
-        <w:t>backend_name</w:t>
-      </w:r>
-      <w:proofErr w:type="spellEnd"/>
-    </w:p>
-    <w:p>
-      <w:r>
-        <w:t xml:space="preserve">FROM </w:t>
-      </w:r>
-      <w:proofErr w:type="spellStart"/>
-      <w:r>
-        <w:t>frontend_developers</w:t>
-      </w:r>
-      <w:proofErr w:type="spellEnd"/>
-    </w:p>
-    <w:p>
-      <w:r>
-        <w:t xml:space="preserve">LEFT OUTER JOIN </w:t>
-      </w:r>
-      <w:proofErr w:type="spellStart"/>
-      <w:r>
-        <w:t>backend_developers</w:t>
-      </w:r>
-      <w:proofErr w:type="spellEnd"/>
+        <w:t xml:space="preserve">    frontend_developers.name AS frontend_name,</w:t>
+      </w:r>
+    </w:p>
+    <w:p>
+      <w:r>
+        <w:t xml:space="preserve">    backend_developers.name AS backend_name</w:t>
+      </w:r>
+    </w:p>
+    <w:p>
+      <w:r>
+        <w:t>FROM frontend_developers</w:t>
+      </w:r>
+    </w:p>
+    <w:p>
+      <w:r>
+        <w:t>LEFT OUTER JOIN backend_developers</w:t>
+      </w:r>
     </w:p>
     <w:p>
       <w:r>
@@ -1219,23 +937,13 @@
     </w:p>
     <w:p>
       <w:r>
-        <w:t xml:space="preserve">from </w:t>
-      </w:r>
-      <w:proofErr w:type="spellStart"/>
-      <w:r>
-        <w:t>frontend_developers</w:t>
-      </w:r>
-      <w:proofErr w:type="spellEnd"/>
-    </w:p>
-    <w:p>
-      <w:r>
-        <w:t xml:space="preserve">right outer join </w:t>
-      </w:r>
-      <w:proofErr w:type="spellStart"/>
-      <w:r>
-        <w:t>backend_developers</w:t>
-      </w:r>
-      <w:proofErr w:type="spellEnd"/>
+        <w:t>from frontend_developers</w:t>
+      </w:r>
+    </w:p>
+    <w:p>
+      <w:r>
+        <w:t>right outer join backend_developers</w:t>
+      </w:r>
     </w:p>
     <w:p>
       <w:r>
@@ -1260,48 +968,22 @@
     <w:p>
       <w:r>
         <w:lastRenderedPageBreak/>
-        <w:t xml:space="preserve">    frontend_developers.name AS </w:t>
-      </w:r>
-      <w:proofErr w:type="spellStart"/>
-      <w:r>
-        <w:t>frontend_name</w:t>
-      </w:r>
-      <w:proofErr w:type="spellEnd"/>
-      <w:r>
-        <w:t>,</w:t>
-      </w:r>
-    </w:p>
-    <w:p>
-      <w:r>
-        <w:t xml:space="preserve">    backend_developers.name AS </w:t>
-      </w:r>
-      <w:proofErr w:type="spellStart"/>
-      <w:r>
-        <w:t>backend_name</w:t>
-      </w:r>
-      <w:proofErr w:type="spellEnd"/>
-    </w:p>
-    <w:p>
-      <w:r>
-        <w:t xml:space="preserve">FROM </w:t>
-      </w:r>
-      <w:proofErr w:type="spellStart"/>
-      <w:r>
-        <w:t>frontend_developers</w:t>
-      </w:r>
-      <w:proofErr w:type="spellEnd"/>
-    </w:p>
-    <w:p>
-      <w:r>
-        <w:t xml:space="preserve">CROSS JOIN </w:t>
-      </w:r>
-      <w:proofErr w:type="spellStart"/>
-      <w:r>
-        <w:t>backend_developers</w:t>
-      </w:r>
-      <w:proofErr w:type="spellEnd"/>
-      <w:r>
-        <w:t>;</w:t>
+        <w:t xml:space="preserve">    frontend_developers.name AS frontend_name,</w:t>
+      </w:r>
+    </w:p>
+    <w:p>
+      <w:r>
+        <w:t xml:space="preserve">    backend_developers.name AS backend_name</w:t>
+      </w:r>
+    </w:p>
+    <w:p>
+      <w:r>
+        <w:t>FROM frontend_developers</w:t>
+      </w:r>
+    </w:p>
+    <w:p>
+      <w:r>
+        <w:t>CROSS JOIN backend_developers;</w:t>
       </w:r>
     </w:p>
     <w:p/>
@@ -1311,8 +993,6 @@
       </w:r>
       <w:r>
         <w:br/>
-      </w:r>
-      <w:r>
         <w:t>SELECT</w:t>
       </w:r>
     </w:p>
@@ -1323,51 +1003,22 @@
     </w:p>
     <w:p>
       <w:r>
-        <w:t xml:space="preserve">    f.name AS </w:t>
-      </w:r>
-      <w:proofErr w:type="spellStart"/>
-      <w:r>
-        <w:t>frontend_name</w:t>
-      </w:r>
-      <w:proofErr w:type="spellEnd"/>
-      <w:r>
-        <w:t>,</w:t>
-      </w:r>
-    </w:p>
-    <w:p>
-      <w:r>
-        <w:t xml:space="preserve">    b.name AS </w:t>
-      </w:r>
-      <w:proofErr w:type="spellStart"/>
-      <w:r>
-        <w:t>backend_name</w:t>
-      </w:r>
-      <w:proofErr w:type="spellEnd"/>
-    </w:p>
-    <w:p>
-      <w:r>
-        <w:t xml:space="preserve">FROM </w:t>
-      </w:r>
-      <w:proofErr w:type="spellStart"/>
-      <w:r>
-        <w:t>frontend_developers</w:t>
-      </w:r>
-      <w:proofErr w:type="spellEnd"/>
-      <w:r>
-        <w:t xml:space="preserve"> f</w:t>
-      </w:r>
-    </w:p>
-    <w:p>
-      <w:r>
-        <w:t xml:space="preserve">FULL OUTER JOIN </w:t>
-      </w:r>
-      <w:proofErr w:type="spellStart"/>
-      <w:r>
-        <w:t>backend_developers</w:t>
-      </w:r>
-      <w:proofErr w:type="spellEnd"/>
-      <w:r>
-        <w:t xml:space="preserve"> b</w:t>
+        <w:t xml:space="preserve">    f.name AS frontend_name,</w:t>
+      </w:r>
+    </w:p>
+    <w:p>
+      <w:r>
+        <w:t xml:space="preserve">    b.name AS backend_name</w:t>
+      </w:r>
+    </w:p>
+    <w:p>
+      <w:r>
+        <w:t>FROM frontend_developers f</w:t>
+      </w:r>
+    </w:p>
+    <w:p>
+      <w:r>
+        <w:t>FULL OUTER JOIN backend_developers b</w:t>
       </w:r>
     </w:p>
     <w:p>
@@ -1382,8 +1033,6 @@
       </w:r>
       <w:r>
         <w:br/>
-      </w:r>
-      <w:r>
         <w:t>SELECT</w:t>
       </w:r>
     </w:p>
@@ -1394,51 +1043,22 @@
     </w:p>
     <w:p>
       <w:r>
-        <w:t xml:space="preserve">    f.name AS </w:t>
-      </w:r>
-      <w:proofErr w:type="spellStart"/>
-      <w:r>
-        <w:t>frontend_name</w:t>
-      </w:r>
-      <w:proofErr w:type="spellEnd"/>
-      <w:r>
-        <w:t>,</w:t>
-      </w:r>
-    </w:p>
-    <w:p>
-      <w:r>
-        <w:t xml:space="preserve">    b.name AS </w:t>
-      </w:r>
-      <w:proofErr w:type="spellStart"/>
-      <w:r>
-        <w:t>backend_name</w:t>
-      </w:r>
-      <w:proofErr w:type="spellEnd"/>
-    </w:p>
-    <w:p>
-      <w:r>
-        <w:t xml:space="preserve">FROM </w:t>
-      </w:r>
-      <w:proofErr w:type="spellStart"/>
-      <w:r>
-        <w:t>frontend_developers</w:t>
-      </w:r>
-      <w:proofErr w:type="spellEnd"/>
-      <w:r>
-        <w:t xml:space="preserve"> f</w:t>
-      </w:r>
-    </w:p>
-    <w:p>
-      <w:r>
-        <w:t xml:space="preserve">LEFT JOIN </w:t>
-      </w:r>
-      <w:proofErr w:type="spellStart"/>
-      <w:r>
-        <w:t>backend_developers</w:t>
-      </w:r>
-      <w:proofErr w:type="spellEnd"/>
-      <w:r>
-        <w:t xml:space="preserve"> b</w:t>
+        <w:t xml:space="preserve">    f.name AS frontend_name,</w:t>
+      </w:r>
+    </w:p>
+    <w:p>
+      <w:r>
+        <w:t xml:space="preserve">    b.name AS backend_name</w:t>
+      </w:r>
+    </w:p>
+    <w:p>
+      <w:r>
+        <w:t>FROM frontend_developers f</w:t>
+      </w:r>
+    </w:p>
+    <w:p>
+      <w:r>
+        <w:t>LEFT JOIN backend_developers b</w:t>
       </w:r>
     </w:p>
     <w:p>
@@ -1465,52 +1085,23 @@
     </w:p>
     <w:p>
       <w:r>
-        <w:t xml:space="preserve">    f.name AS </w:t>
-      </w:r>
-      <w:proofErr w:type="spellStart"/>
-      <w:r>
-        <w:t>frontend_name</w:t>
-      </w:r>
-      <w:proofErr w:type="spellEnd"/>
-      <w:r>
-        <w:t>,</w:t>
-      </w:r>
-    </w:p>
-    <w:p>
-      <w:r>
-        <w:t xml:space="preserve">    b.name AS </w:t>
-      </w:r>
-      <w:proofErr w:type="spellStart"/>
-      <w:r>
-        <w:t>backend_name</w:t>
-      </w:r>
-      <w:proofErr w:type="spellEnd"/>
+        <w:t xml:space="preserve">    f.name AS frontend_name,</w:t>
+      </w:r>
+    </w:p>
+    <w:p>
+      <w:r>
+        <w:t xml:space="preserve">    b.name AS backend_name</w:t>
+      </w:r>
     </w:p>
     <w:p>
       <w:r>
         <w:lastRenderedPageBreak/>
-        <w:t xml:space="preserve">FROM </w:t>
-      </w:r>
-      <w:proofErr w:type="spellStart"/>
-      <w:r>
-        <w:t>frontend_developers</w:t>
-      </w:r>
-      <w:proofErr w:type="spellEnd"/>
-      <w:r>
-        <w:t xml:space="preserve"> f</w:t>
-      </w:r>
-    </w:p>
-    <w:p>
-      <w:r>
-        <w:t xml:space="preserve">RIGHT JOIN </w:t>
-      </w:r>
-      <w:proofErr w:type="spellStart"/>
-      <w:r>
-        <w:t>backend_developers</w:t>
-      </w:r>
-      <w:proofErr w:type="spellEnd"/>
-      <w:r>
-        <w:t xml:space="preserve"> b</w:t>
+        <w:t>FROM frontend_developers f</w:t>
+      </w:r>
+    </w:p>
+    <w:p>
+      <w:r>
+        <w:t>RIGHT JOIN backend_developers b</w:t>
       </w:r>
     </w:p>
     <w:p>
@@ -1570,25 +1161,12 @@
         <w:br/>
       </w:r>
       <w:r>
-        <w:t xml:space="preserve">CREATE INDEX </w:t>
-      </w:r>
-      <w:proofErr w:type="spellStart"/>
-      <w:r>
-        <w:t>idx_frontend_name</w:t>
-      </w:r>
-      <w:proofErr w:type="spellEnd"/>
-    </w:p>
-    <w:p>
-      <w:r>
-        <w:t xml:space="preserve">ON </w:t>
-      </w:r>
-      <w:proofErr w:type="spellStart"/>
-      <w:r>
-        <w:t>frontend_developers</w:t>
-      </w:r>
-      <w:proofErr w:type="spellEnd"/>
-      <w:r>
-        <w:t>(name);</w:t>
+        <w:t>CREATE INDEX idx_frontend_name</w:t>
+      </w:r>
+    </w:p>
+    <w:p>
+      <w:r>
+        <w:t>ON frontend_developers(name);</w:t>
       </w:r>
     </w:p>
     <w:p/>
@@ -1599,33 +1177,12 @@
     </w:p>
     <w:p>
       <w:r>
-        <w:t xml:space="preserve">CREATE UNIQUE INDEX </w:t>
-      </w:r>
-      <w:proofErr w:type="spellStart"/>
-      <w:r>
-        <w:t>idx_frontend_project</w:t>
-      </w:r>
-      <w:proofErr w:type="spellEnd"/>
-    </w:p>
-    <w:p>
-      <w:r>
-        <w:t xml:space="preserve">ON </w:t>
-      </w:r>
-      <w:proofErr w:type="spellStart"/>
-      <w:r>
-        <w:t>frontend_developers</w:t>
-      </w:r>
-      <w:proofErr w:type="spellEnd"/>
-      <w:r>
-        <w:t>(</w:t>
-      </w:r>
-      <w:proofErr w:type="spellStart"/>
-      <w:r>
-        <w:t>project_id</w:t>
-      </w:r>
-      <w:proofErr w:type="spellEnd"/>
-      <w:r>
-        <w:t>);</w:t>
+        <w:t>CREATE UNIQUE INDEX idx_frontend_project</w:t>
+      </w:r>
+    </w:p>
+    <w:p>
+      <w:r>
+        <w:t>ON frontend_developers(project_id);</w:t>
       </w:r>
     </w:p>
     <w:p/>
@@ -1641,36 +1198,12 @@
     </w:p>
     <w:p>
       <w:r>
-        <w:t xml:space="preserve">ON </w:t>
-      </w:r>
-      <w:proofErr w:type="spellStart"/>
-      <w:r>
-        <w:t>frontend_developers</w:t>
-      </w:r>
-      <w:proofErr w:type="spellEnd"/>
-      <w:r>
-        <w:t>(</w:t>
-      </w:r>
-      <w:proofErr w:type="spellStart"/>
-      <w:r>
-        <w:t>project_id</w:t>
-      </w:r>
-      <w:proofErr w:type="spellEnd"/>
-      <w:r>
-        <w:t>)</w:t>
-      </w:r>
-    </w:p>
-    <w:p>
-      <w:r>
-        <w:t xml:space="preserve">WHERE </w:t>
-      </w:r>
-      <w:proofErr w:type="spellStart"/>
-      <w:r>
-        <w:t>project_id</w:t>
-      </w:r>
-      <w:proofErr w:type="spellEnd"/>
-      <w:r>
-        <w:t xml:space="preserve"> = 'P44';</w:t>
+        <w:t>ON frontend_developers(project_id)</w:t>
+      </w:r>
+    </w:p>
+    <w:p>
+      <w:r>
+        <w:t>WHERE project_id = 'P44';</w:t>
       </w:r>
     </w:p>
     <w:p/>
@@ -1681,51 +1214,17 @@
     </w:p>
     <w:p>
       <w:r>
-        <w:t xml:space="preserve">SELECT </w:t>
-      </w:r>
-      <w:proofErr w:type="spellStart"/>
-      <w:r>
-        <w:t>indexname</w:t>
-      </w:r>
-      <w:proofErr w:type="spellEnd"/>
-      <w:r>
-        <w:t xml:space="preserve">, </w:t>
-      </w:r>
-      <w:proofErr w:type="spellStart"/>
-      <w:r>
-        <w:t>indexdef</w:t>
-      </w:r>
-      <w:proofErr w:type="spellEnd"/>
-    </w:p>
-    <w:p>
-      <w:r>
-        <w:t xml:space="preserve">FROM </w:t>
-      </w:r>
-      <w:proofErr w:type="spellStart"/>
-      <w:r>
-        <w:t>pg_indexes</w:t>
-      </w:r>
-      <w:proofErr w:type="spellEnd"/>
-    </w:p>
-    <w:p>
-      <w:r>
-        <w:t xml:space="preserve">WHERE </w:t>
-      </w:r>
-      <w:proofErr w:type="spellStart"/>
-      <w:r>
-        <w:t>tablename</w:t>
-      </w:r>
-      <w:proofErr w:type="spellEnd"/>
-      <w:r>
-        <w:t xml:space="preserve"> = '</w:t>
-      </w:r>
-      <w:proofErr w:type="spellStart"/>
-      <w:r>
-        <w:t>frontend_developers</w:t>
-      </w:r>
-      <w:proofErr w:type="spellEnd"/>
-      <w:r>
-        <w:t>';</w:t>
+        <w:t>SELECT indexname, indexdef</w:t>
+      </w:r>
+    </w:p>
+    <w:p>
+      <w:r>
+        <w:t>FROM pg_indexes</w:t>
+      </w:r>
+    </w:p>
+    <w:p>
+      <w:r>
+        <w:t>WHERE tablename = 'frontend_developers';</w:t>
       </w:r>
     </w:p>
     <w:p/>
@@ -1782,7 +1281,7 @@
       <w:r>
         <w:lastRenderedPageBreak/>
         <w:pict w14:anchorId="12F81E66">
-          <v:rect id="_x0000_i1086" style="width:0;height:1.5pt" o:hralign="center" o:hrstd="t" o:hr="t" fillcolor="#a0a0a0" stroked="f"/>
+          <v:rect id="_x0000_i1025" style="width:0;height:1.5pt" o:hralign="center" o:hrstd="t" o:hr="t" fillcolor="#a0a0a0" stroked="f"/>
         </w:pict>
       </w:r>
     </w:p>
@@ -1817,15 +1316,7 @@
     </w:p>
     <w:p>
       <w:r>
-        <w:t xml:space="preserve">CREATE SCHEMA AUTHORIZATION </w:t>
-      </w:r>
-      <w:proofErr w:type="spellStart"/>
-      <w:r>
-        <w:t>postgres</w:t>
-      </w:r>
-      <w:proofErr w:type="spellEnd"/>
-      <w:r>
-        <w:t>;</w:t>
+        <w:t>CREATE SCHEMA AUTHORIZATION postgres;</w:t>
       </w:r>
     </w:p>
     <w:p>
@@ -1837,21 +1328,13 @@
         <w:t>Note:</w:t>
       </w:r>
       <w:r>
-        <w:t xml:space="preserve"> Replace </w:t>
-      </w:r>
-      <w:proofErr w:type="spellStart"/>
-      <w:r>
-        <w:t>postgres</w:t>
-      </w:r>
-      <w:proofErr w:type="spellEnd"/>
-      <w:r>
-        <w:t xml:space="preserve"> with your PostgreSQL username if it is different.</w:t>
+        <w:t xml:space="preserve"> Replace postgres with your PostgreSQL username if it is different.</w:t>
       </w:r>
     </w:p>
     <w:p>
       <w:r>
         <w:pict w14:anchorId="53B2E4ED">
-          <v:rect id="_x0000_i1087" style="width:0;height:1.5pt" o:hralign="center" o:hrstd="t" o:hr="t" fillcolor="#a0a0a0" stroked="f"/>
+          <v:rect id="_x0000_i1026" style="width:0;height:1.5pt" o:hralign="center" o:hrstd="t" o:hr="t" fillcolor="#a0a0a0" stroked="f"/>
         </w:pict>
       </w:r>
     </w:p>
@@ -1886,15 +1369,7 @@
     </w:p>
     <w:p>
       <w:r>
-        <w:t xml:space="preserve">CREATE TABLE </w:t>
-      </w:r>
-      <w:proofErr w:type="spellStart"/>
-      <w:r>
-        <w:t>company.employees</w:t>
-      </w:r>
-      <w:proofErr w:type="spellEnd"/>
-      <w:r>
-        <w:t xml:space="preserve"> (</w:t>
+        <w:t>CREATE TABLE company.employees (</w:t>
       </w:r>
     </w:p>
     <w:p>
@@ -1920,7 +1395,7 @@
     <w:p>
       <w:r>
         <w:pict w14:anchorId="110548F1">
-          <v:rect id="_x0000_i1088" style="width:0;height:1.5pt" o:hralign="center" o:hrstd="t" o:hr="t" fillcolor="#a0a0a0" stroked="f"/>
+          <v:rect id="_x0000_i1027" style="width:0;height:1.5pt" o:hralign="center" o:hrstd="t" o:hr="t" fillcolor="#a0a0a0" stroked="f"/>
         </w:pict>
       </w:r>
     </w:p>
@@ -1955,15 +1430,7 @@
     </w:p>
     <w:p>
       <w:r>
-        <w:t xml:space="preserve">INSERT INTO </w:t>
-      </w:r>
-      <w:proofErr w:type="spellStart"/>
-      <w:r>
-        <w:t>company.employees</w:t>
-      </w:r>
-      <w:proofErr w:type="spellEnd"/>
-      <w:r>
-        <w:t xml:space="preserve"> (name, department)</w:t>
+        <w:t>INSERT INTO company.employees (name, department)</w:t>
       </w:r>
     </w:p>
     <w:p>
@@ -1984,7 +1451,7 @@
     <w:p>
       <w:r>
         <w:pict w14:anchorId="12CC0E29">
-          <v:rect id="_x0000_i1089" style="width:0;height:1.5pt" o:hralign="center" o:hrstd="t" o:hr="t" fillcolor="#a0a0a0" stroked="f"/>
+          <v:rect id="_x0000_i1028" style="width:0;height:1.5pt" o:hralign="center" o:hrstd="t" o:hr="t" fillcolor="#a0a0a0" stroked="f"/>
         </w:pict>
       </w:r>
     </w:p>
@@ -2020,15 +1487,7 @@
     <w:p>
       <w:r>
         <w:lastRenderedPageBreak/>
-        <w:t xml:space="preserve">SELECT * FROM </w:t>
-      </w:r>
-      <w:proofErr w:type="spellStart"/>
-      <w:r>
-        <w:t>company.employees</w:t>
-      </w:r>
-      <w:proofErr w:type="spellEnd"/>
-      <w:r>
-        <w:t>;</w:t>
+        <w:t>SELECT * FROM company.employees;</w:t>
       </w:r>
     </w:p>
     <w:p/>
@@ -2059,17 +1518,8 @@
           <w:b/>
           <w:bCs/>
         </w:rPr>
-        <w:t xml:space="preserve">Can you create a java code and connect with the </w:t>
-      </w:r>
-      <w:proofErr w:type="spellStart"/>
-      <w:r>
-        <w:rPr>
-          <w:b/>
-          <w:bCs/>
-        </w:rPr>
-        <w:t>postgresql</w:t>
-      </w:r>
-      <w:proofErr w:type="spellEnd"/>
+        <w:t>Can you create a java code and connect with the postgresql</w:t>
+      </w:r>
       <w:r>
         <w:rPr>
           <w:b/>
@@ -2082,7 +1532,7 @@
     <w:p>
       <w:r>
         <w:pict w14:anchorId="3947EEBF">
-          <v:rect id="_x0000_i1090" style="width:0;height:1.5pt" o:hralign="center" o:hrstd="t" o:hr="t" fillcolor="#a0a0a0" stroked="f"/>
+          <v:rect id="_x0000_i1029" style="width:0;height:1.5pt" o:hralign="center" o:hrstd="t" o:hr="t" fillcolor="#a0a0a0" stroked="f"/>
         </w:pict>
       </w:r>
     </w:p>
@@ -2135,7 +1585,7 @@
     <w:p>
       <w:r>
         <w:pict w14:anchorId="179EE38A">
-          <v:rect id="_x0000_i1091" style="width:0;height:1.5pt" o:hralign="center" o:hrstd="t" o:hr="t" fillcolor="#a0a0a0" stroked="f"/>
+          <v:rect id="_x0000_i1030" style="width:0;height:1.5pt" o:hralign="center" o:hrstd="t" o:hr="t" fillcolor="#a0a0a0" stroked="f"/>
         </w:pict>
       </w:r>
     </w:p>
@@ -2198,30 +1648,14 @@
         <w:br/>
       </w:r>
       <w:r>
-        <w:t xml:space="preserve">package </w:t>
-      </w:r>
-      <w:proofErr w:type="spellStart"/>
-      <w:r>
-        <w:t>com.example.jdbc</w:t>
-      </w:r>
-      <w:proofErr w:type="spellEnd"/>
-      <w:r>
-        <w:t>;</w:t>
-      </w:r>
-      <w:r>
-        <w:br/>
-      </w:r>
-      <w:r>
-        <w:br/>
-        <w:t xml:space="preserve">import </w:t>
-      </w:r>
-      <w:proofErr w:type="spellStart"/>
-      <w:r>
-        <w:t>java.sql</w:t>
-      </w:r>
-      <w:proofErr w:type="spellEnd"/>
-      <w:r>
-        <w:t>.*;</w:t>
+        <w:t>package com.example.jdbc;</w:t>
+      </w:r>
+      <w:r>
+        <w:br/>
+      </w:r>
+      <w:r>
+        <w:br/>
+        <w:t>import java.sql.*;</w:t>
       </w:r>
       <w:r>
         <w:br/>
@@ -2235,82 +1669,37 @@
       </w:r>
       <w:r>
         <w:br/>
-        <w:t xml:space="preserve">    public static void main(String[] </w:t>
-      </w:r>
-      <w:proofErr w:type="spellStart"/>
-      <w:r>
-        <w:t>args</w:t>
-      </w:r>
-      <w:proofErr w:type="spellEnd"/>
-      <w:r>
-        <w:t>) {</w:t>
-      </w:r>
-      <w:r>
-        <w:br/>
-      </w:r>
-      <w:r>
-        <w:br/>
-        <w:t xml:space="preserve">        String </w:t>
-      </w:r>
-      <w:proofErr w:type="spellStart"/>
-      <w:r>
-        <w:t>url</w:t>
-      </w:r>
-      <w:proofErr w:type="spellEnd"/>
-      <w:r>
-        <w:t xml:space="preserve"> = "</w:t>
-      </w:r>
-      <w:proofErr w:type="spellStart"/>
-      <w:r>
-        <w:t>jdbc:</w:t>
+        <w:t>    public static void main(String[] args) {</w:t>
+      </w:r>
+      <w:r>
+        <w:br/>
+      </w:r>
+      <w:r>
+        <w:br/>
+        <w:t>        String url = "jdbc:</w:t>
       </w:r>
       <w:hyperlink r:id="rId8" w:tgtFrame="_blank" w:history="1">
         <w:r>
           <w:rPr>
             <w:rStyle w:val="Hyperlink"/>
           </w:rPr>
-          <w:t>postgresql</w:t>
+          <w:t>postgresql://localhost:5432/BankDB</w:t>
         </w:r>
-        <w:proofErr w:type="spellEnd"/>
-        <w:r>
-          <w:rPr>
-            <w:rStyle w:val="Hyperlink"/>
-          </w:rPr>
-          <w:t>://localhost:5432/</w:t>
-        </w:r>
-        <w:proofErr w:type="spellStart"/>
-        <w:r>
-          <w:rPr>
-            <w:rStyle w:val="Hyperlink"/>
-          </w:rPr>
-          <w:t>BankDB</w:t>
-        </w:r>
-        <w:proofErr w:type="spellEnd"/>
       </w:hyperlink>
       <w:r>
         <w:t>";</w:t>
       </w:r>
       <w:r>
         <w:br/>
-        <w:t>        String username = "</w:t>
-      </w:r>
-      <w:proofErr w:type="spellStart"/>
-      <w:r>
-        <w:t>postgres</w:t>
-      </w:r>
-      <w:proofErr w:type="spellEnd"/>
-      <w:r>
-        <w:t>";</w:t>
+        <w:t>        String username = "postgres";</w:t>
       </w:r>
       <w:r>
         <w:br/>
         <w:t>        String password = "</w:t>
       </w:r>
-      <w:proofErr w:type="spellStart"/>
       <w:r>
         <w:t>sujal</w:t>
       </w:r>
-      <w:proofErr w:type="spellEnd"/>
       <w:r>
         <w:t>";</w:t>
       </w:r>
@@ -2329,182 +1718,70 @@
       </w:r>
       <w:r>
         <w:br/>
-        <w:t xml:space="preserve">            Connection </w:t>
-      </w:r>
-      <w:proofErr w:type="spellStart"/>
-      <w:r>
-        <w:t>connection</w:t>
-      </w:r>
-      <w:proofErr w:type="spellEnd"/>
-      <w:r>
-        <w:t xml:space="preserve"> =</w:t>
-      </w:r>
-      <w:r>
-        <w:br/>
-        <w:t>                    </w:t>
-      </w:r>
-      <w:proofErr w:type="spellStart"/>
-      <w:r>
-        <w:t>DriverManager.getConnection</w:t>
-      </w:r>
-      <w:proofErr w:type="spellEnd"/>
-      <w:r>
-        <w:t>(</w:t>
-      </w:r>
-      <w:proofErr w:type="spellStart"/>
-      <w:r>
-        <w:t>url</w:t>
-      </w:r>
-      <w:proofErr w:type="spellEnd"/>
-      <w:r>
-        <w:t>, username, password);</w:t>
-      </w:r>
-      <w:r>
-        <w:br/>
-      </w:r>
-      <w:r>
-        <w:br/>
-        <w:t>            </w:t>
-      </w:r>
-      <w:proofErr w:type="spellStart"/>
-      <w:r>
-        <w:t>System.out.println</w:t>
-      </w:r>
-      <w:proofErr w:type="spellEnd"/>
-      <w:r>
-        <w:t>("Connected Successfully");</w:t>
-      </w:r>
-      <w:r>
-        <w:br/>
-      </w:r>
-      <w:r>
-        <w:br/>
-        <w:t xml:space="preserve">            Statement </w:t>
-      </w:r>
-      <w:proofErr w:type="spellStart"/>
-      <w:r>
-        <w:t>statement</w:t>
-      </w:r>
-      <w:proofErr w:type="spellEnd"/>
-      <w:r>
-        <w:t xml:space="preserve"> =</w:t>
-      </w:r>
-      <w:r>
-        <w:br/>
-        <w:t>                    </w:t>
-      </w:r>
-      <w:proofErr w:type="spellStart"/>
-      <w:r>
-        <w:t>connection.createStatement</w:t>
-      </w:r>
-      <w:proofErr w:type="spellEnd"/>
-      <w:r>
-        <w:t>();</w:t>
-      </w:r>
-      <w:r>
-        <w:br/>
-      </w:r>
-      <w:r>
-        <w:br/>
-        <w:t>            </w:t>
-      </w:r>
-      <w:proofErr w:type="spellStart"/>
-      <w:r>
-        <w:t>ResultSet</w:t>
-      </w:r>
-      <w:proofErr w:type="spellEnd"/>
-      <w:r>
-        <w:t xml:space="preserve"> result =</w:t>
-      </w:r>
-      <w:r>
-        <w:br/>
-        <w:t>                    </w:t>
-      </w:r>
-      <w:proofErr w:type="spellStart"/>
-      <w:r>
-        <w:t>statement.executeQuery</w:t>
-      </w:r>
-      <w:proofErr w:type="spellEnd"/>
-      <w:r>
-        <w:t>("SELECT * FROM Accounts");</w:t>
-      </w:r>
-      <w:r>
-        <w:br/>
-      </w:r>
-      <w:r>
-        <w:br/>
-        <w:t>            while(</w:t>
-      </w:r>
-      <w:proofErr w:type="spellStart"/>
-      <w:r>
-        <w:t>result.next</w:t>
-      </w:r>
-      <w:proofErr w:type="spellEnd"/>
-      <w:r>
-        <w:t>()){</w:t>
-      </w:r>
-      <w:r>
-        <w:br/>
-      </w:r>
-      <w:r>
-        <w:br/>
-        <w:t>                </w:t>
-      </w:r>
-      <w:proofErr w:type="spellStart"/>
-      <w:r>
-        <w:t>System.out.println</w:t>
-      </w:r>
-      <w:proofErr w:type="spellEnd"/>
-      <w:r>
-        <w:t>(</w:t>
-      </w:r>
-      <w:r>
-        <w:br/>
-        <w:t>                        </w:t>
-      </w:r>
-      <w:proofErr w:type="spellStart"/>
-      <w:r>
-        <w:t>result.getInt</w:t>
-      </w:r>
-      <w:proofErr w:type="spellEnd"/>
-      <w:r>
-        <w:t>("id") + " " +</w:t>
-      </w:r>
-      <w:r>
-        <w:br/>
-        <w:t>                        </w:t>
-      </w:r>
-      <w:proofErr w:type="spellStart"/>
-      <w:r>
-        <w:t>result.getString</w:t>
-      </w:r>
-      <w:proofErr w:type="spellEnd"/>
-      <w:r>
-        <w:t>("name") + " " +</w:t>
-      </w:r>
-      <w:r>
-        <w:br/>
-        <w:t>                        </w:t>
-      </w:r>
-      <w:proofErr w:type="spellStart"/>
-      <w:r>
-        <w:t>result.getString</w:t>
-      </w:r>
-      <w:proofErr w:type="spellEnd"/>
-      <w:r>
-        <w:t>("email") + " " +</w:t>
-      </w:r>
-      <w:r>
-        <w:br/>
-        <w:t>                        </w:t>
-      </w:r>
-      <w:proofErr w:type="spellStart"/>
-      <w:r>
-        <w:t>result.getDouble</w:t>
-      </w:r>
-      <w:proofErr w:type="spellEnd"/>
-      <w:r>
-        <w:t>("balance")</w:t>
+        <w:t>            Connection connection =</w:t>
+      </w:r>
+      <w:r>
+        <w:br/>
+        <w:t>                    DriverManager.getConnection(url, username, password);</w:t>
+      </w:r>
+      <w:r>
+        <w:br/>
+      </w:r>
+      <w:r>
+        <w:br/>
+        <w:t>            System.out.println("Connected Successfully");</w:t>
+      </w:r>
+      <w:r>
+        <w:br/>
+      </w:r>
+      <w:r>
+        <w:br/>
+        <w:t>            Statement statement =</w:t>
+      </w:r>
+      <w:r>
+        <w:br/>
+        <w:t>                    connection.createStatement();</w:t>
+      </w:r>
+      <w:r>
+        <w:br/>
+      </w:r>
+      <w:r>
+        <w:br/>
+        <w:t>            ResultSet result =</w:t>
+      </w:r>
+      <w:r>
+        <w:br/>
+        <w:t>                    statement.executeQuery("SELECT * FROM Accounts");</w:t>
+      </w:r>
+      <w:r>
+        <w:br/>
+      </w:r>
+      <w:r>
+        <w:br/>
+        <w:t>            while(result.next()){</w:t>
+      </w:r>
+      <w:r>
+        <w:br/>
+      </w:r>
+      <w:r>
+        <w:br/>
+        <w:t>                System.out.println(</w:t>
+      </w:r>
+      <w:r>
+        <w:br/>
+        <w:t>                        result.getInt("id") + " " +</w:t>
+      </w:r>
+      <w:r>
+        <w:br/>
+        <w:t>                        result.getString("name") + " " +</w:t>
+      </w:r>
+      <w:r>
+        <w:br/>
+        <w:t>                        result.getString("email") + " " +</w:t>
+      </w:r>
+      <w:r>
+        <w:br/>
+        <w:t>                        result.getDouble("balance")</w:t>
       </w:r>
       <w:r>
         <w:br/>
@@ -2522,15 +1799,7 @@
       </w:r>
       <w:r>
         <w:br/>
-        <w:t>            </w:t>
-      </w:r>
-      <w:proofErr w:type="spellStart"/>
-      <w:r>
-        <w:t>connection.close</w:t>
-      </w:r>
-      <w:proofErr w:type="spellEnd"/>
-      <w:r>
-        <w:t>();</w:t>
+        <w:t>            connection.close();</w:t>
       </w:r>
       <w:r>
         <w:br/>
@@ -2544,15 +1813,7 @@
       </w:r>
       <w:r>
         <w:br/>
-        <w:t>            </w:t>
-      </w:r>
-      <w:proofErr w:type="spellStart"/>
-      <w:r>
-        <w:t>e.printStackTrace</w:t>
-      </w:r>
-      <w:proofErr w:type="spellEnd"/>
-      <w:r>
-        <w:t>();</w:t>
+        <w:t>            e.printStackTrace();</w:t>
       </w:r>
       <w:r>
         <w:br/>
@@ -2577,6 +1838,522 @@
       </w:r>
     </w:p>
     <w:p/>
+    <w:p/>
+    <w:p/>
+    <w:p/>
+    <w:p>
+      <w:pPr>
+        <w:rPr>
+          <w:b/>
+          <w:bCs/>
+        </w:rPr>
+      </w:pPr>
+      <w:r>
+        <w:rPr>
+          <w:b/>
+          <w:bCs/>
+        </w:rPr>
+        <w:lastRenderedPageBreak/>
+        <w:t>Home Tasks</w:t>
+      </w:r>
+    </w:p>
+    <w:p>
+      <w:pPr>
+        <w:rPr>
+          <w:b/>
+          <w:bCs/>
+        </w:rPr>
+      </w:pPr>
+      <w:r>
+        <w:rPr>
+          <w:b/>
+          <w:bCs/>
+        </w:rPr>
+        <w:t>Task 1: What are Window Functions in PostgreSQL?</w:t>
+      </w:r>
+    </w:p>
+    <w:p>
+      <w:pPr>
+        <w:rPr>
+          <w:b/>
+          <w:bCs/>
+        </w:rPr>
+      </w:pPr>
+      <w:r>
+        <w:rPr>
+          <w:b/>
+          <w:bCs/>
+        </w:rPr>
+        <w:t>Answer:</w:t>
+      </w:r>
+    </w:p>
+    <w:p>
+      <w:r>
+        <w:t>Window functions are special SQL functions that perform calculations across a group of rows while keeping each row separate. Unlike GROUP BY, they do not combine rows into one.</w:t>
+      </w:r>
+    </w:p>
+    <w:p>
+      <w:r>
+        <w:t>Example:</w:t>
+      </w:r>
+    </w:p>
+    <w:p>
+      <w:r>
+        <w:t>Finding the salary rank of each employee without hiding individual employee records.</w:t>
+      </w:r>
+    </w:p>
+    <w:p/>
+    <w:p>
+      <w:pPr>
+        <w:rPr>
+          <w:b/>
+          <w:bCs/>
+        </w:rPr>
+      </w:pPr>
+      <w:r>
+        <w:rPr>
+          <w:b/>
+          <w:bCs/>
+        </w:rPr>
+        <w:t>Task 2: What are the keywords that we use in Window Functions?</w:t>
+      </w:r>
+    </w:p>
+    <w:p>
+      <w:r>
+        <w:t>Answer:</w:t>
+      </w:r>
+    </w:p>
+    <w:p/>
+    <w:p>
+      <w:r>
+        <w:t>Common keywords used are:</w:t>
+      </w:r>
+    </w:p>
+    <w:p>
+      <w:r>
+        <w:t>OVER</w:t>
+      </w:r>
+    </w:p>
+    <w:p>
+      <w:r>
+        <w:t>PARTITION BY</w:t>
+      </w:r>
+    </w:p>
+    <w:p>
+      <w:r>
+        <w:t>ORDER BY</w:t>
+      </w:r>
+    </w:p>
+    <w:p>
+      <w:r>
+        <w:t>ROWS</w:t>
+      </w:r>
+    </w:p>
+    <w:p>
+      <w:r>
+        <w:t>RANGE</w:t>
+      </w:r>
+    </w:p>
+    <w:p/>
+    <w:p>
+      <w:r>
+        <w:t>Example:</w:t>
+      </w:r>
+    </w:p>
+    <w:p>
+      <w:r>
+        <w:t>SELECT name, salary,</w:t>
+      </w:r>
+    </w:p>
+    <w:p>
+      <w:r>
+        <w:t>RANK() OVER (ORDER BY salary DESC)</w:t>
+      </w:r>
+    </w:p>
+    <w:p>
+      <w:r>
+        <w:t>FROM Employee;</w:t>
+      </w:r>
+    </w:p>
+    <w:p/>
+    <w:p>
+      <w:pPr>
+        <w:rPr>
+          <w:b/>
+          <w:bCs/>
+        </w:rPr>
+      </w:pPr>
+      <w:r>
+        <w:rPr>
+          <w:b/>
+          <w:bCs/>
+        </w:rPr>
+        <w:t>Task 3: What are the types of Window Functions in PostgreSQL?</w:t>
+      </w:r>
+    </w:p>
+    <w:p/>
+    <w:p>
+      <w:r>
+        <w:t>Answer:</w:t>
+      </w:r>
+    </w:p>
+    <w:p>
+      <w:r>
+        <w:t>There are mainly three types of window functions:</w:t>
+      </w:r>
+    </w:p>
+    <w:p>
+      <w:r>
+        <w:t>| Type                | Examples                                           |</w:t>
+      </w:r>
+    </w:p>
+    <w:p>
+      <w:r>
+        <w:lastRenderedPageBreak/>
+        <w:t>| ------------------- | -------------------------------------------------- |</w:t>
+      </w:r>
+    </w:p>
+    <w:p>
+      <w:r>
+        <w:t>| Ranking Functions   | `RANK()`, `DENSE_RANK()`, `ROW_NUMBER()`           |</w:t>
+      </w:r>
+    </w:p>
+    <w:p>
+      <w:r>
+        <w:t>| Aggregate Functions | `SUM()`, `AVG()`, `COUNT()`, `MAX()`, `MIN()`      |</w:t>
+      </w:r>
+    </w:p>
+    <w:p>
+      <w:r>
+        <w:t>| Value Functions     | `LAG()`, `LEAD()`, `FIRST_VALUE()`, `LAST_VALUE()` |</w:t>
+      </w:r>
+    </w:p>
+    <w:p/>
+    <w:p/>
+    <w:p>
+      <w:pPr>
+        <w:rPr>
+          <w:b/>
+          <w:bCs/>
+        </w:rPr>
+      </w:pPr>
+      <w:r>
+        <w:rPr>
+          <w:b/>
+          <w:bCs/>
+        </w:rPr>
+        <w:t>Task 4: What are the rules while working on Window Functions?</w:t>
+      </w:r>
+    </w:p>
+    <w:p>
+      <w:pPr>
+        <w:rPr>
+          <w:b/>
+          <w:bCs/>
+        </w:rPr>
+      </w:pPr>
+      <w:r>
+        <w:rPr>
+          <w:b/>
+          <w:bCs/>
+        </w:rPr>
+        <w:t>Answer:</w:t>
+      </w:r>
+    </w:p>
+    <w:p>
+      <w:r>
+        <w:t>Some important rules are:</w:t>
+      </w:r>
+    </w:p>
+    <w:p>
+      <w:r>
+        <w:t>Always use the OVER() clause.</w:t>
+      </w:r>
+    </w:p>
+    <w:p>
+      <w:r>
+        <w:t>Window functions do not reduce the number of rows.</w:t>
+      </w:r>
+    </w:p>
+    <w:p>
+      <w:r>
+        <w:t>They are applied after WHERE, GROUP BY, and HAVING.</w:t>
+      </w:r>
+    </w:p>
+    <w:p>
+      <w:r>
+        <w:t>PARTITION BY is optional.</w:t>
+      </w:r>
+    </w:p>
+    <w:p>
+      <w:r>
+        <w:t>ORDER BY is used when row order matters (like ranking).</w:t>
+      </w:r>
+    </w:p>
+    <w:p/>
+    <w:p>
+      <w:r>
+        <w:t>Example:</w:t>
+      </w:r>
+    </w:p>
+    <w:p/>
+    <w:p>
+      <w:r>
+        <w:t>ROW_NUMBER() needs an ORDER BY to decide the row numbers.</w:t>
+      </w:r>
+    </w:p>
+    <w:p/>
+    <w:p>
+      <w:pPr>
+        <w:rPr>
+          <w:b/>
+          <w:bCs/>
+        </w:rPr>
+      </w:pPr>
+      <w:r>
+        <w:rPr>
+          <w:b/>
+          <w:bCs/>
+        </w:rPr>
+        <w:t>Task 5: Do we have JSON/JSONB data types in PostgreSQL? What is the difference between them?</w:t>
+      </w:r>
+    </w:p>
+    <w:p>
+      <w:pPr>
+        <w:rPr>
+          <w:b/>
+          <w:bCs/>
+        </w:rPr>
+      </w:pPr>
+      <w:r>
+        <w:rPr>
+          <w:b/>
+          <w:bCs/>
+        </w:rPr>
+        <w:t>Answer:</w:t>
+      </w:r>
+    </w:p>
+    <w:p>
+      <w:r>
+        <w:t>Yes, PostgreSQL supports both JSON and JSONB.</w:t>
+      </w:r>
+    </w:p>
+    <w:p>
+      <w:r>
+        <w:t>| JSON                      | JSONB                                    |</w:t>
+      </w:r>
+    </w:p>
+    <w:p>
+      <w:r>
+        <w:t>| ------------------------- | ---------------------------------------- |</w:t>
+      </w:r>
+    </w:p>
+    <w:p>
+      <w:r>
+        <w:t>| Stores data as plain text | Stores data in binary format             |</w:t>
+      </w:r>
+    </w:p>
+    <w:p>
+      <w:r>
+        <w:t>| Faster to insert          | Faster to search and query               |</w:t>
+      </w:r>
+    </w:p>
+    <w:p>
+      <w:r>
+        <w:t>| Keeps original formatting | Removes extra spaces and sorts keys      |</w:t>
+      </w:r>
+    </w:p>
+    <w:p>
+      <w:r>
+        <w:lastRenderedPageBreak/>
+        <w:t>| Slower for searching      | Better performance for most applications |</w:t>
+      </w:r>
+    </w:p>
+    <w:p/>
+    <w:p>
+      <w:r>
+        <w:t>Example:</w:t>
+      </w:r>
+    </w:p>
+    <w:p/>
+    <w:p>
+      <w:r>
+        <w:t>Store customer details like name, email, and address in a JSON document.</w:t>
+      </w:r>
+    </w:p>
+    <w:p/>
+    <w:p>
+      <w:pPr>
+        <w:rPr>
+          <w:b/>
+          <w:bCs/>
+        </w:rPr>
+      </w:pPr>
+      <w:r>
+        <w:rPr>
+          <w:b/>
+          <w:bCs/>
+        </w:rPr>
+        <w:t>Task 6: What is Full Text Search in PostgreSQL? Explain briefly.</w:t>
+      </w:r>
+    </w:p>
+    <w:p>
+      <w:pPr>
+        <w:rPr>
+          <w:b/>
+          <w:bCs/>
+        </w:rPr>
+      </w:pPr>
+      <w:r>
+        <w:rPr>
+          <w:b/>
+          <w:bCs/>
+        </w:rPr>
+        <w:t>Answer:</w:t>
+      </w:r>
+    </w:p>
+    <w:p>
+      <w:r>
+        <w:t>Full Text Search is a PostgreSQL feature that allows you to search words or phrases efficiently inside large text data.</w:t>
+      </w:r>
+    </w:p>
+    <w:p/>
+    <w:p>
+      <w:r>
+        <w:t>It is much faster and more accurate than using the LIKE operator.</w:t>
+      </w:r>
+    </w:p>
+    <w:p/>
+    <w:p>
+      <w:r>
+        <w:t>Example:</w:t>
+      </w:r>
+    </w:p>
+    <w:p/>
+    <w:p>
+      <w:r>
+        <w:t>Searching for the word "Java" in thousands of blog articles.</w:t>
+      </w:r>
+    </w:p>
+    <w:p/>
+    <w:p>
+      <w:pPr>
+        <w:rPr>
+          <w:b/>
+          <w:bCs/>
+        </w:rPr>
+      </w:pPr>
+      <w:r>
+        <w:rPr>
+          <w:b/>
+          <w:bCs/>
+        </w:rPr>
+        <w:t>Task 7: What do you understand by Full Text Search in PostgreSQL?</w:t>
+      </w:r>
+    </w:p>
+    <w:p>
+      <w:pPr>
+        <w:rPr>
+          <w:b/>
+          <w:bCs/>
+        </w:rPr>
+      </w:pPr>
+      <w:r>
+        <w:rPr>
+          <w:b/>
+          <w:bCs/>
+        </w:rPr>
+        <w:t>Answer:</w:t>
+      </w:r>
+    </w:p>
+    <w:p>
+      <w:r>
+        <w:t>Full Text Search helps find relevant words in text documents by understanding words instead of matching exact characters. It supports fast searching in large amounts of text.</w:t>
+      </w:r>
+    </w:p>
+    <w:p>
+      <w:r>
+        <w:t>Example:</w:t>
+      </w:r>
+    </w:p>
+    <w:p>
+      <w:r>
+        <w:t>An e-commerce website searching products using keywords like "wireless mouse".</w:t>
+      </w:r>
+    </w:p>
+    <w:p/>
+    <w:p>
+      <w:pPr>
+        <w:rPr>
+          <w:b/>
+          <w:bCs/>
+        </w:rPr>
+      </w:pPr>
+      <w:r>
+        <w:rPr>
+          <w:b/>
+          <w:bCs/>
+        </w:rPr>
+        <w:t>Task 8: What does SAVEPOINT do in PostgreSQL?</w:t>
+      </w:r>
+    </w:p>
+    <w:p>
+      <w:pPr>
+        <w:rPr>
+          <w:b/>
+          <w:bCs/>
+        </w:rPr>
+      </w:pPr>
+      <w:r>
+        <w:rPr>
+          <w:b/>
+          <w:bCs/>
+        </w:rPr>
+        <w:t>Answer:</w:t>
+      </w:r>
+    </w:p>
+    <w:p>
+      <w:r>
+        <w:t>A SAVEPOINT creates a temporary checkpoint inside a transaction. If an error occurs later, you can roll back to that savepoint instead of canceling the entire transaction.</w:t>
+      </w:r>
+    </w:p>
+    <w:p/>
+    <w:p>
+      <w:r>
+        <w:t>Example:</w:t>
+      </w:r>
+    </w:p>
+    <w:p>
+      <w:r>
+        <w:t>In a bank transaction:</w:t>
+      </w:r>
+    </w:p>
+    <w:p>
+      <w:r>
+        <w:t>Money is deposited.</w:t>
+      </w:r>
+    </w:p>
+    <w:p>
+      <w:r>
+        <w:t>A SAVEPOINT is created.</w:t>
+      </w:r>
+    </w:p>
+    <w:p>
+      <w:r>
+        <w:t>The next operation fails.</w:t>
+      </w:r>
+    </w:p>
+    <w:p>
+      <w:r>
+        <w:t>Roll back only to the savepoint instead of canceling the whole transaction.</w:t>
+      </w:r>
+    </w:p>
+    <w:p/>
+    <w:p>
+      <w:r>
+        <w:t>This saves the successful work done before the savepoint.</w:t>
+      </w:r>
+    </w:p>
     <w:p>
       <w:pPr>
         <w:rPr>
@@ -4125,6 +3902,7 @@
   <w:style w:type="character" w:default="1" w:styleId="DefaultParagraphFont">
     <w:name w:val="Default Paragraph Font"/>
     <w:uiPriority w:val="1"/>
+    <w:semiHidden/>
     <w:unhideWhenUsed/>
   </w:style>
   <w:style w:type="table" w:default="1" w:styleId="TableNormal">

</xml_diff>